<commit_message>
Add frozen-policy common500 7 dB results to Figure 2
</commit_message>
<xml_diff>
--- a/paper/manuscripts/nestcom_wcl_focused_20261029_v6/manuscript_review.docx
+++ b/paper/manuscripts/nestcom_wcl_focused_20261029_v6/manuscript_review.docx
@@ -1268,7 +1268,7 @@
               <a:graphicData uri="http://schemas.openxmlformats.org/drawingml/2006/picture">
                 <pic:pic>
                   <pic:nvPicPr>
-                    <pic:cNvPr descr="C:/Users/11946/Documents/ChatGPT/comm/.research/nestcom_fig3_4db_20261029_v1/word_build03/figure1.png" id="15" name="Picture"/>
+                    <pic:cNvPr descr="C:/Users/11946/Documents/ChatGPT/comm/.research/nestcom_7db_common500_20261030_v1/word_work/build02/figure1.png" id="15" name="Picture"/>
                     <pic:cNvPicPr>
                       <a:picLocks noChangeArrowheads="1" noChangeAspect="1"/>
                     </pic:cNvPicPr>
@@ -2843,7 +2843,7 @@
               <a:graphicData uri="http://schemas.openxmlformats.org/drawingml/2006/picture">
                 <pic:pic>
                   <pic:nvPicPr>
-                    <pic:cNvPr descr="C:/Users/11946/Documents/ChatGPT/comm/.research/nestcom_fig3_4db_20261029_v1/word_build03/figure2.png" id="22" name="Picture"/>
+                    <pic:cNvPr descr="C:/Users/11946/Documents/ChatGPT/comm/.research/nestcom_7db_common500_20261030_v1/word_work/build02/figure2.png" id="22" name="Picture"/>
                     <pic:cNvPicPr>
                       <a:picLocks noChangeArrowheads="1" noChangeAspect="1"/>
                     </pic:cNvPicPr>
@@ -2910,19 +2910,20 @@
         <m:r>
           <m:t>1024</m:t>
         </m:r>
-        <m:r>
-          <m:rPr>
-            <m:sty m:val="p"/>
-          </m:rPr>
-          <m:t>.</m:t>
-        </m:r>
       </m:oMath>
       <w:r>
         <w:rPr>
           <w:b w:val="0"/>
           <w:sz w:val="20"/>
         </w:rPr>
-        <w:t xml:space="preserve"> Points and error bars are equal-source means and pointwise 95% source-bootstrap intervals after averaging three channel outcomes per source. Lower LPIPS-Alex and DreamSim are favorable. Ada denotes the predicted-class, fixed-frame adaptation.</w:t>
+        <w:t xml:space="preserve"> </w:t>
+      </w:r>
+      <w:r>
+        <w:rPr>
+          <w:b w:val="0"/>
+          <w:sz w:val="20"/>
+        </w:rPr>
+        <w:t xml:space="preserve">and 4/7/10/19 dB. Points and error bars are equal-source means and pointwise 95% source-bootstrap intervals after averaging three channel outcomes per source. Lower LPIPS-Alex and DreamSim are favorable. Ada denotes the predicted-class, fixed-frame adaptation.</w:t>
       </w:r>
     </w:p>
     <w:bookmarkEnd w:id="23"/>
@@ -2944,7 +2945,7 @@
         <w:widowControl/>
       </w:pPr>
       <w:r>
-        <w:t xml:space="preserve">We use common500 ImageNet validation images [11], a disjoint cal1000 set, and Kodak24 [12], with fixed</w:t>
+        <w:t xml:space="preserve">We use common500 ImageNet validation images [11], disjoint cal1000, and Kodak24 [12], with fixed</w:t>
       </w:r>
       <w:r>
         <w:t xml:space="preserve"> </w:t>
@@ -2967,7 +2968,7 @@
         <w:t xml:space="preserve"> </w:t>
       </w:r>
       <w:r>
-        <w:t xml:space="preserve">preprocessing. ImageNet-calibrated policies remain fixed on Kodak. The six-system main study uses</w:t>
+        <w:t xml:space="preserve">preprocessing and unchanged ImageNet policies on Kodak. Six systems use</w:t>
       </w:r>
       <w:r>
         <w:t xml:space="preserve"> </w:t>
@@ -3019,7 +3020,33 @@
         </m:r>
       </m:oMath>
       <w:r>
-        <w:t xml:space="preserve"> each calibrated separately at 4/10/19 dB.</w:t>
+        <w:t xml:space="preserve"> independently calibrated at 4/10/19 dB. The added 7-dB common500 point uses all six systems at</w:t>
+      </w:r>
+      <w:r>
+        <w:t xml:space="preserve"> </w:t>
+      </w:r>
+      <m:oMath>
+        <m:r>
+          <m:t>N</m:t>
+        </m:r>
+        <m:r>
+          <m:rPr>
+            <m:sty m:val="p"/>
+          </m:rPr>
+          <m:t>=</m:t>
+        </m:r>
+        <m:r>
+          <m:t>1024</m:t>
+        </m:r>
+        <m:r>
+          <m:rPr>
+            <m:sty m:val="p"/>
+          </m:rPr>
+          <m:t>,</m:t>
+        </m:r>
+      </m:oMath>
+      <w:r>
+        <w:t xml:space="preserve"> with policies frozen on 100 calibration images (Supplement S9).</w:t>
       </w:r>
     </w:p>
     <w:p>
@@ -5084,7 +5111,7 @@
         <w:widowControl/>
       </w:pPr>
       <w:r>
-        <w:t xml:space="preserve">Block C uses identical actual received prefixes to examine how boundary information affects reconstruction. At 10 dB, adding residual correction (B0–A0) reduces LPIPS by 0.01003; then updating finer-scale conditioning (C0–B0) reduces it by a further 0.01662. The corresponding DreamSim differences are −0.00845 [−0.01136, −0.00564] and −0.01537 [−0.01988, −0.01111]. These ordered interventions show how the additional source tokens constrain perceptual reconstruction. At 19 dB the boundary lies in the final scale, so the conditioning update has zero effect.</w:t>
+        <w:t xml:space="preserve">Block C holds actual received prefixes fixed. At 10 dB, residual correction (B0–A0) reduces LPIPS by 0.01003; subsequent conditioning update (C0–B0) reduces it by 0.01662. Corresponding DreamSim differences are −0.00845 [−0.01136, −0.00564] and −0.01537 [−0.01988, −0.01111]. At 19 dB the boundary lies in the final scale, so the conditioning update has zero effect.</w:t>
       </w:r>
     </w:p>
     <w:p>
@@ -5125,7 +5152,7 @@
               <a:graphicData uri="http://schemas.openxmlformats.org/drawingml/2006/picture">
                 <pic:pic>
                   <pic:nvPicPr>
-                    <pic:cNvPr descr="C:/Users/11946/Documents/ChatGPT/comm/.research/nestcom_fig3_4db_20261029_v1/word_build03/figure3.png" id="29" name="Picture"/>
+                    <pic:cNvPr descr="C:/Users/11946/Documents/ChatGPT/comm/.research/nestcom_7db_common500_20261030_v1/word_work/build02/figure3.png" id="29" name="Picture"/>
                     <pic:cNvPicPr>
                       <a:picLocks noChangeArrowheads="1" noChangeAspect="1"/>
                     </pic:cNvPicPr>
@@ -6179,7 +6206,7 @@
         <w:widowControl/>
       </w:pPr>
       <w:r>
-        <w:t xml:space="preserve">Fig. 2 compares the six complete systems at</w:t>
+        <w:t xml:space="preserve">Fig. 2 compares six systems at</w:t>
       </w:r>
       <w:r>
         <w:t xml:space="preserve"> </w:t>
@@ -6205,7 +6232,7 @@
         </m:r>
       </m:oMath>
       <w:r>
-        <w:t xml:space="preserve"> NeST has lower mean LPIPS and DreamSim than SwinJSCC, BPG, and ARPC at all tested SNRs. Table II shows the associated pixel-fidelity results: SwinJSCC and BPG have higher PSNR throughout. Against Latent JSCC, NeST has lower DreamSim at all three points; at 4 dB Latent JSCC has lower LPIPS and higher PSNR.</w:t>
+        <w:t xml:space="preserve"> NeST has lower LPIPS and DreamSim than SwinJSCC, BPG, and ARPC throughout. SwinJSCC and BPG have higher PSNR at 4/10/19 dB (Table II). Against Latent JSCC, NeST has lower DreamSim at all four points; Latent JSCC has lower LPIPS and higher PSNR at 4/7 dB.</w:t>
       </w:r>
     </w:p>
     <w:p>
@@ -6214,7 +6241,7 @@
         <w:widowControl/>
       </w:pPr>
       <w:r>
-        <w:t xml:space="preserve">At 4 dB, NeST achieves mean LPIPS/DreamSim of 0.263/0.184, compared with 0.395/0.243 for Ada. At 10 dB Ada has lower LPIPS and DreamSim and higher CLIP-I, whereas NeST has higher PSNR. At 19 dB NeST has lower LPIPS, while Ada has slightly lower DreamSim. Ada also has higher CLIP-I at 4 dB. NeST’s PSNR gains over Ada are 4.116/0.455/1.226 dB at 4/10/19 dB. All 1500 evaluated transmissions per SNR succeed for NeST, WHOLE, and Ada, so their overall and success-conditioned means coincide (Supplement S2).</w:t>
+        <w:t xml:space="preserve">At 4 dB, NeST’s LPIPS/DreamSim are 0.263/0.184 versus Ada’s 0.395/0.243. At 7 dB, NeST lowers LPIPS by 0.0584 [0.0533, 0.0637] versus Ada; their DreamSim difference is 0.0012 [−0.0052, 0.0074], with no clear advantage. Ada has lower LPIPS/DreamSim at 10 dB and higher CLIP-I at 4/10 dB. At 19 dB NeST has lower LPIPS, but Ada has slightly lower DreamSim. NeST has higher PSNR than Ada throughout. NeST/WHOLE/Ada have no failures in 1500 trials per original SNR (Supplement S2). At 7 dB, NeST/Ada/BPG reject 6/7/11 of 1500 receptions each; gray failures remain in the means (S9).</w:t>
       </w:r>
     </w:p>
     <w:p>
@@ -6319,7 +6346,7 @@
         </m:r>
       </m:oMath>
       <w:r>
-        <w:t xml:space="preserve"> 10 dB are 220.89/398.82 ms (RTX PRO 6000, six cores, batch one, 16 sources, three repetitions; Supplement S5). ARPC averages 268.64 caption bits including mode/length fields; visual tokens occupy 56.80/74.57/84.10% of its source container at 4/10/19 dB (100-source audit; S1.3).</w:t>
+        <w:t xml:space="preserve"> 10 dB are 220.89/398.82 ms (RTX PRO 6000, six cores, batch one, 16 sources, three repetitions; Supplement S5). ARPC’s 100-source payload audit, including paid caption fields, is in S1.3.</w:t>
       </w:r>
     </w:p>
     <w:p>

</xml_diff>